<commit_message>
Add North America hotel collection
</commit_message>
<xml_diff>
--- a/50fivestarhotels.docx
+++ b/50fivestarhotels.docx
@@ -5,6 +5,15 @@
     <w:p/>
     <w:sdt>
       <w:sdtPr>
+        <w:rPr>
+          <w:rFonts w:asciiTheme="minorHAnsi" w:eastAsiaTheme="minorHAnsi" w:hAnsiTheme="minorHAnsi" w:cstheme="minorBidi"/>
+          <w:color w:val="auto"/>
+          <w:kern w:val="2"/>
+          <w:sz w:val="24"/>
+          <w:szCs w:val="24"/>
+          <w:lang w:val="en-GB"/>
+          <w14:ligatures w14:val="standardContextual"/>
+        </w:rPr>
         <w:id w:val="1594668857"/>
         <w:docPartObj>
           <w:docPartGallery w:val="Table of Contents"/>
@@ -13,16 +22,9 @@
       </w:sdtPr>
       <w:sdtEndPr>
         <w:rPr>
-          <w:rFonts w:asciiTheme="minorHAnsi" w:eastAsiaTheme="minorHAnsi" w:hAnsiTheme="minorHAnsi" w:cstheme="minorBidi"/>
           <w:b/>
           <w:bCs/>
           <w:noProof/>
-          <w:color w:val="auto"/>
-          <w:kern w:val="2"/>
-          <w:sz w:val="24"/>
-          <w:szCs w:val="24"/>
-          <w:lang w:val="en-GB"/>
-          <w14:ligatures w14:val="standardContextual"/>
         </w:rPr>
       </w:sdtEndPr>
       <w:sdtContent>
@@ -127,7 +129,6 @@
     </w:sdt>
     <w:p/>
     <w:p/>
-    <w:p/>
     <w:p>
       <w:pPr>
         <w:pStyle w:val="Heading1"/>
@@ -139,17 +140,48 @@
       <w:bookmarkEnd w:id="0"/>
     </w:p>
     <w:p/>
+    <w:p/>
     <w:p>
       <w:r>
         <w:rPr>
           <w:highlight w:val="green"/>
         </w:rPr>
+        <w:t>Active project folder:</w:t>
+      </w:r>
+    </w:p>
+    <w:p>
+      <w:r>
+        <w:t>C:\Users\Gary\code\50fivestarhotels</w:t>
+      </w:r>
+    </w:p>
+    <w:p/>
+    <w:p>
+      <w:r>
+        <w:t>ChatGPT images</w:t>
+      </w:r>
+    </w:p>
+    <w:p>
+      <w:r>
+        <w:t>C:\Users\Gary\code\50fivestarhotels\images generated</w:t>
+      </w:r>
+    </w:p>
+    <w:p/>
+    <w:p>
+      <w:r>
+        <w:rPr>
+          <w:highlight w:val="green"/>
+        </w:rPr>
         <w:t>Software Stack</w:t>
       </w:r>
     </w:p>
     <w:p>
-      <w:r>
-        <w:t>Github, Git Bash, Astro, Cloudflare Pages, Tailwind CSS v4</w:t>
+      <w:proofErr w:type="spellStart"/>
+      <w:r>
+        <w:t>Github</w:t>
+      </w:r>
+      <w:proofErr w:type="spellEnd"/>
+      <w:r>
+        <w:t>, Git Bash, Astro, Cloudflare Pages, Tailwind CSS v4</w:t>
       </w:r>
     </w:p>
     <w:p/>
@@ -183,12 +215,22 @@
         <w:rPr>
           <w:highlight w:val="green"/>
         </w:rPr>
-        <w:t>Active project folder:</w:t>
-      </w:r>
-    </w:p>
-    <w:p>
-      <w:r>
-        <w:t>C:\Users\Gary\code\50fivestarhotels</w:t>
+        <w:t>Git Bash:</w:t>
+      </w:r>
+    </w:p>
+    <w:p>
+      <w:r>
+        <w:t>cd "/c/Users/Gary/code/50fivestarhotels"</w:t>
+      </w:r>
+    </w:p>
+    <w:p>
+      <w:proofErr w:type="spellStart"/>
+      <w:r>
+        <w:t>npm</w:t>
+      </w:r>
+      <w:proofErr w:type="spellEnd"/>
+      <w:r>
+        <w:t xml:space="preserve"> run build</w:t>
       </w:r>
     </w:p>
     <w:p/>
@@ -197,17 +239,32 @@
         <w:rPr>
           <w:highlight w:val="green"/>
         </w:rPr>
-        <w:t>Git Bash:</w:t>
-      </w:r>
-    </w:p>
-    <w:p>
-      <w:r>
-        <w:t>cd "/c/Users/Gary/code/50fivestarhotels"</w:t>
-      </w:r>
-    </w:p>
-    <w:p>
-      <w:r>
-        <w:t>npm run build</w:t>
+        <w:t>Publish changes:</w:t>
+      </w:r>
+    </w:p>
+    <w:p>
+      <w:r>
+        <w:t>git status</w:t>
+      </w:r>
+    </w:p>
+    <w:p>
+      <w:r>
+        <w:t xml:space="preserve">git </w:t>
+      </w:r>
+      <w:proofErr w:type="gramStart"/>
+      <w:r>
+        <w:t>add .</w:t>
+      </w:r>
+      <w:proofErr w:type="gramEnd"/>
+    </w:p>
+    <w:p>
+      <w:r>
+        <w:t>git commit -m "Update 50 five-star hotel guides"</w:t>
+      </w:r>
+    </w:p>
+    <w:p>
+      <w:r>
+        <w:t>git push</w:t>
       </w:r>
     </w:p>
     <w:p/>
@@ -216,27 +273,12 @@
         <w:rPr>
           <w:highlight w:val="green"/>
         </w:rPr>
-        <w:t>Publish changes:</w:t>
-      </w:r>
-    </w:p>
-    <w:p>
-      <w:r>
-        <w:t>git status</w:t>
-      </w:r>
-    </w:p>
-    <w:p>
-      <w:r>
-        <w:t>git add .</w:t>
-      </w:r>
-    </w:p>
-    <w:p>
-      <w:r>
-        <w:t>git commit -m "Update 50 five-star hotel guides"</w:t>
-      </w:r>
-    </w:p>
-    <w:p>
-      <w:r>
-        <w:t>git push</w:t>
+        <w:t>Source images folder:</w:t>
+      </w:r>
+    </w:p>
+    <w:p>
+      <w:r>
+        <w:t>C:\Users\Gary\code\50fivestarhotels\public\images\hotels</w:t>
       </w:r>
     </w:p>
     <w:p/>
@@ -245,12 +287,13 @@
         <w:rPr>
           <w:highlight w:val="green"/>
         </w:rPr>
-        <w:t>Source images folder:</w:t>
-      </w:r>
-    </w:p>
-    <w:p>
-      <w:r>
-        <w:t>C:\Users\Gary\code\50fivestarhotels\public\images\hotels</w:t>
+        <w:t>Research folder:</w:t>
+      </w:r>
+    </w:p>
+    <w:p>
+      <w:r>
+        <w:lastRenderedPageBreak/>
+        <w:t>C:\Users\Gary\code\50fivestarhotels\research</w:t>
       </w:r>
     </w:p>
     <w:p/>
@@ -259,12 +302,12 @@
         <w:rPr>
           <w:highlight w:val="green"/>
         </w:rPr>
-        <w:t>Research folder:</w:t>
-      </w:r>
-    </w:p>
-    <w:p>
-      <w:r>
-        <w:t>C:\Users\Gary\code\50fivestarhotels\research</w:t>
+        <w:t>Scripts folder:</w:t>
+      </w:r>
+    </w:p>
+    <w:p>
+      <w:r>
+        <w:t>C:\Users\Gary\code\50fivestarhotels\scripts</w:t>
       </w:r>
     </w:p>
     <w:p/>
@@ -273,160 +316,394 @@
         <w:rPr>
           <w:highlight w:val="green"/>
         </w:rPr>
-        <w:t>Scripts folder:</w:t>
-      </w:r>
-    </w:p>
-    <w:p>
+        <w:t>GitHub:</w:t>
+      </w:r>
+    </w:p>
+    <w:p>
+      <w:r>
+        <w:t>https://github.com/barberryid/50fivestarhotels</w:t>
+      </w:r>
+    </w:p>
+    <w:p/>
+    <w:p>
+      <w:r>
+        <w:rPr>
+          <w:highlight w:val="green"/>
+        </w:rPr>
+        <w:t>Cloudflare:</w:t>
+      </w:r>
+    </w:p>
+    <w:p>
+      <w:r>
+        <w:t>https://50fivestarhotels.pages.dev/</w:t>
+      </w:r>
+    </w:p>
+    <w:p/>
+    <w:p>
+      <w:r>
+        <w:rPr>
+          <w:highlight w:val="green"/>
+        </w:rPr>
+        <w:t>Cloudflare Pages project:</w:t>
+      </w:r>
+    </w:p>
+    <w:p>
+      <w:r>
+        <w:t>50fivestarhotels</w:t>
+      </w:r>
+    </w:p>
+    <w:p/>
+    <w:p>
+      <w:r>
+        <w:rPr>
+          <w:highlight w:val="green"/>
+        </w:rPr>
+        <w:t>Production branch:</w:t>
+      </w:r>
+    </w:p>
+    <w:p>
+      <w:r>
+        <w:t>main</w:t>
+      </w:r>
+    </w:p>
+    <w:p/>
+    <w:p>
+      <w:r>
+        <w:rPr>
+          <w:highlight w:val="green"/>
+        </w:rPr>
+        <w:t>Build settings:</w:t>
+      </w:r>
+    </w:p>
+    <w:p>
+      <w:r>
+        <w:t xml:space="preserve">Build command: </w:t>
+      </w:r>
+      <w:proofErr w:type="spellStart"/>
+      <w:r>
+        <w:t>npm</w:t>
+      </w:r>
+      <w:proofErr w:type="spellEnd"/>
+      <w:r>
+        <w:t xml:space="preserve"> run build</w:t>
+      </w:r>
+    </w:p>
+    <w:p>
+      <w:r>
+        <w:t xml:space="preserve">Build output directory: </w:t>
+      </w:r>
+      <w:proofErr w:type="spellStart"/>
+      <w:r>
+        <w:t>dist</w:t>
+      </w:r>
+      <w:proofErr w:type="spellEnd"/>
+    </w:p>
+    <w:p>
+      <w:r>
+        <w:t>Root directory: /</w:t>
+      </w:r>
+    </w:p>
+    <w:p/>
+    <w:p>
+      <w:r>
+        <w:rPr>
+          <w:highlight w:val="green"/>
+        </w:rPr>
+        <w:t>Local homepage file:</w:t>
+      </w:r>
+    </w:p>
+    <w:p>
+      <w:r>
+        <w:t>C:\Users\Gary\code\50fivestarhotels\src\pages\index.astro</w:t>
+      </w:r>
+    </w:p>
+    <w:p/>
+    <w:p>
+      <w:r>
+        <w:rPr>
+          <w:highlight w:val="cyan"/>
+        </w:rPr>
+        <w:t>Update</w:t>
+      </w:r>
+      <w:r>
+        <w:rPr>
+          <w:highlight w:val="cyan"/>
+        </w:rPr>
+        <w:t xml:space="preserve"> commit and push</w:t>
+      </w:r>
+      <w:r>
+        <w:rPr>
+          <w:highlight w:val="cyan"/>
+        </w:rPr>
+        <w:t xml:space="preserve"> the</w:t>
+      </w:r>
+      <w:r>
+        <w:t xml:space="preserve"> </w:t>
+      </w:r>
+      <w:r>
+        <w:rPr>
+          <w:highlight w:val="green"/>
+        </w:rPr>
+        <w:t>Project brief:</w:t>
+      </w:r>
+    </w:p>
+    <w:p>
+      <w:r>
+        <w:t>C:\Users\Gary\code\50fivestarhotels\50fivestarhotels_project_brief.md</w:t>
+      </w:r>
+    </w:p>
+    <w:p/>
+    <w:p/>
+    <w:p>
+      <w:r>
+        <w:rPr>
+          <w:highlight w:val="green"/>
+        </w:rPr>
+        <w:t>Google Search Console</w:t>
+      </w:r>
+    </w:p>
+    <w:p>
+      <w:hyperlink r:id="rId6" w:history="1">
+        <w:r>
+          <w:rPr>
+            <w:rStyle w:val="Hyperlink"/>
+          </w:rPr>
+          <w:t>https://search.google.com/search-console/sitemaps?resource_id=sc-domain%3A50fivestarhotels.com</w:t>
+        </w:r>
+      </w:hyperlink>
+    </w:p>
+    <w:p/>
+    <w:p/>
+    <w:p/>
+    <w:p>
+      <w:pPr>
+        <w:pStyle w:val="Heading2"/>
+      </w:pPr>
+      <w:r>
+        <w:t>INSTRUCTIONS</w:t>
+      </w:r>
+    </w:p>
+    <w:p/>
+    <w:p>
+      <w:pPr>
+        <w:pStyle w:val="Heading2"/>
+      </w:pPr>
+      <w:r>
+        <w:t>NOW</w:t>
+      </w:r>
+    </w:p>
+    <w:p/>
+    <w:p>
+      <w:pPr>
+        <w:pStyle w:val="Heading2"/>
+      </w:pPr>
       <w:r>
         <w:lastRenderedPageBreak/>
-        <w:t>C:\Users\Gary\code\50fivestarhotels\scripts</w:t>
-      </w:r>
-    </w:p>
-    <w:p/>
-    <w:p>
-      <w:r>
-        <w:rPr>
-          <w:highlight w:val="green"/>
-        </w:rPr>
-        <w:t>GitHub:</w:t>
-      </w:r>
-    </w:p>
-    <w:p>
-      <w:r>
-        <w:t>https://github.com/barberryid/50fivestarhotels</w:t>
-      </w:r>
-    </w:p>
-    <w:p/>
-    <w:p>
-      <w:r>
-        <w:rPr>
-          <w:highlight w:val="green"/>
-        </w:rPr>
-        <w:t>Cloudflare:</w:t>
-      </w:r>
-    </w:p>
-    <w:p>
-      <w:r>
-        <w:t>https://50fivestarhotels.pages.dev/</w:t>
-      </w:r>
-    </w:p>
-    <w:p/>
-    <w:p>
-      <w:r>
-        <w:t>Cloudflare Pages project:</w:t>
-      </w:r>
-    </w:p>
-    <w:p>
-      <w:r>
-        <w:t>50fivestarhotels</w:t>
-      </w:r>
-    </w:p>
-    <w:p/>
-    <w:p>
-      <w:r>
-        <w:t>Production branch:</w:t>
-      </w:r>
-    </w:p>
-    <w:p>
-      <w:r>
-        <w:t>main</w:t>
-      </w:r>
-    </w:p>
-    <w:p/>
-    <w:p>
-      <w:r>
-        <w:rPr>
-          <w:highlight w:val="green"/>
-        </w:rPr>
-        <w:t>Build settings:</w:t>
-      </w:r>
-    </w:p>
-    <w:p>
-      <w:r>
-        <w:t>Build command: npm run build</w:t>
-      </w:r>
-    </w:p>
-    <w:p>
-      <w:r>
-        <w:t>Build output directory: dist</w:t>
-      </w:r>
-    </w:p>
-    <w:p>
-      <w:r>
-        <w:t>Root directory: /</w:t>
-      </w:r>
-    </w:p>
-    <w:p/>
-    <w:p>
-      <w:r>
-        <w:rPr>
-          <w:highlight w:val="green"/>
-        </w:rPr>
-        <w:t>Local homepage file:</w:t>
-      </w:r>
-    </w:p>
-    <w:p>
-      <w:r>
-        <w:t>C:\Users\Gary\code\50fivestarhotels\src\pages\index.astro</w:t>
-      </w:r>
-    </w:p>
-    <w:p/>
-    <w:p>
-      <w:r>
-        <w:rPr>
-          <w:highlight w:val="green"/>
-        </w:rPr>
-        <w:t>Project brief:</w:t>
-      </w:r>
-    </w:p>
-    <w:p>
-      <w:r>
-        <w:t>C:\Users\Gary\code\50fivestarhotels\50fivestarhotels_project_brief.md</w:t>
-      </w:r>
-    </w:p>
-    <w:p/>
-    <w:p/>
-    <w:p/>
-    <w:p/>
+        <w:t>NEXT</w:t>
+      </w:r>
+    </w:p>
+    <w:p/>
+    <w:p>
+      <w:pPr>
+        <w:rPr>
+          <w:highlight w:val="yellow"/>
+        </w:rPr>
+      </w:pPr>
+      <w:r>
+        <w:rPr>
+          <w:highlight w:val="yellow"/>
+        </w:rPr>
+        <w:t>Add in an air quality bar per hotel</w:t>
+      </w:r>
+    </w:p>
+    <w:p>
+      <w:r>
+        <w:rPr>
+          <w:highlight w:val="yellow"/>
+        </w:rPr>
+        <w:t>https://50fivestarhotels.com/</w:t>
+      </w:r>
+    </w:p>
+    <w:p>
+      <w:r>
+        <w:drawing>
+          <wp:inline distT="0" distB="0" distL="0" distR="0" wp14:anchorId="42ABDB6F" wp14:editId="0EABE821">
+            <wp:extent cx="5731510" cy="2085975"/>
+            <wp:effectExtent l="0" t="0" r="2540" b="9525"/>
+            <wp:docPr id="178188374" name="Picture 1"/>
+            <wp:cNvGraphicFramePr>
+              <a:graphicFrameLocks xmlns:a="http://schemas.openxmlformats.org/drawingml/2006/main" noChangeAspect="1"/>
+            </wp:cNvGraphicFramePr>
+            <a:graphic xmlns:a="http://schemas.openxmlformats.org/drawingml/2006/main">
+              <a:graphicData uri="http://schemas.openxmlformats.org/drawingml/2006/picture">
+                <pic:pic xmlns:pic="http://schemas.openxmlformats.org/drawingml/2006/picture">
+                  <pic:nvPicPr>
+                    <pic:cNvPr id="178188374" name=""/>
+                    <pic:cNvPicPr/>
+                  </pic:nvPicPr>
+                  <pic:blipFill>
+                    <a:blip r:embed="rId7"/>
+                    <a:stretch>
+                      <a:fillRect/>
+                    </a:stretch>
+                  </pic:blipFill>
+                  <pic:spPr>
+                    <a:xfrm>
+                      <a:off x="0" y="0"/>
+                      <a:ext cx="5731510" cy="2085975"/>
+                    </a:xfrm>
+                    <a:prstGeom prst="rect">
+                      <a:avLst/>
+                    </a:prstGeom>
+                  </pic:spPr>
+                </pic:pic>
+              </a:graphicData>
+            </a:graphic>
+          </wp:inline>
+        </w:drawing>
+      </w:r>
+    </w:p>
+    <w:p/>
+    <w:p>
+      <w:r>
+        <w:rPr>
+          <w:highlight w:val="yellow"/>
+        </w:rPr>
+        <w:t xml:space="preserve">wrap the weather, </w:t>
+      </w:r>
+      <w:proofErr w:type="spellStart"/>
+      <w:r>
+        <w:rPr>
+          <w:highlight w:val="yellow"/>
+        </w:rPr>
+        <w:t>aq</w:t>
+      </w:r>
+      <w:proofErr w:type="spellEnd"/>
+      <w:r>
+        <w:rPr>
+          <w:highlight w:val="yellow"/>
+        </w:rPr>
+        <w:t xml:space="preserve"> and price cards for mobile</w:t>
+      </w:r>
+    </w:p>
+    <w:p/>
+    <w:p>
+      <w:r>
+        <w:t>In Codex</w:t>
+      </w:r>
+    </w:p>
+    <w:p>
+      <w:pPr>
+        <w:rPr>
+          <w:highlight w:val="yellow"/>
+        </w:rPr>
+      </w:pPr>
+      <w:r>
+        <w:rPr>
+          <w:highlight w:val="yellow"/>
+        </w:rPr>
+        <w:t>The daylight image is not generated yet: the built-in image tool returned </w:t>
+      </w:r>
+      <w:proofErr w:type="spellStart"/>
+      <w:r>
+        <w:rPr>
+          <w:highlight w:val="yellow"/>
+        </w:rPr>
+        <w:t>TooManyRequests</w:t>
+      </w:r>
+      <w:proofErr w:type="spellEnd"/>
+      <w:r>
+        <w:rPr>
+          <w:highlight w:val="yellow"/>
+        </w:rPr>
+        <w:t> on repeated retries. I left the placeholder marker at:</w:t>
+      </w:r>
+    </w:p>
+    <w:p>
+      <w:pPr>
+        <w:rPr>
+          <w:highlight w:val="yellow"/>
+        </w:rPr>
+      </w:pPr>
+      <w:r>
+        <w:rPr>
+          <w:highlight w:val="yellow"/>
+        </w:rPr>
+        <w:t>C:\Users\Gary\code\50fivestarhotels\public\images\hotels\bar-peepal-resort-pokhara-realistic-daylight.webp.txt</w:t>
+      </w:r>
+    </w:p>
+    <w:p>
+      <w:r>
+        <w:rPr>
+          <w:highlight w:val="yellow"/>
+        </w:rPr>
+        <w:t>The daylight prompt is ready in the prompt file for the next run once the image rate limit clears.</w:t>
+      </w:r>
+    </w:p>
+    <w:p/>
+    <w:p/>
+    <w:p>
+      <w:r>
+        <w:t>The brief's own next step: add profile pages for the 5 candidates that already have AI images but no content file (Meliá Yangon, Grand Mercure Medan, NH Collection Bogotá, Novotel Ahmedabad, Mandarin Colombo) — their public/images/hotels/* assets are currently orphaned.</w:t>
+      </w:r>
+    </w:p>
+    <w:p/>
+    <w:p>
+      <w:pPr>
+        <w:rPr>
+          <w:b/>
+          <w:bCs/>
+          <w:highlight w:val="yellow"/>
+        </w:rPr>
+      </w:pPr>
+      <w:r>
+        <w:rPr>
+          <w:b/>
+          <w:bCs/>
+          <w:highlight w:val="yellow"/>
+        </w:rPr>
+        <w:t>10 practical tips to help you decide</w:t>
+      </w:r>
+    </w:p>
+    <w:p>
+      <w:r>
+        <w:rPr>
+          <w:highlight w:val="yellow"/>
+        </w:rPr>
+        <w:t xml:space="preserve">Copy this styling from </w:t>
+      </w:r>
+      <w:r>
+        <w:rPr>
+          <w:highlight w:val="yellow"/>
+        </w:rPr>
+        <w:t>50beautiful pages</w:t>
+      </w:r>
+    </w:p>
+    <w:p/>
+    <w:p>
+      <w:r>
+        <w:t>List of why to go to this area where the hotel is located</w:t>
+      </w:r>
+    </w:p>
     <w:p/>
     <w:p>
       <w:pPr>
         <w:pStyle w:val="Heading2"/>
       </w:pPr>
       <w:r>
-        <w:t>INSTRUCTIONS</w:t>
-      </w:r>
-    </w:p>
-    <w:p/>
-    <w:p>
-      <w:pPr>
-        <w:pStyle w:val="Heading2"/>
-      </w:pPr>
-      <w:r>
-        <w:t>NOW</w:t>
-      </w:r>
-    </w:p>
-    <w:p>
-      <w:pPr>
-        <w:pStyle w:val="Heading2"/>
-      </w:pPr>
-      <w:r>
-        <w:t>NEXT</w:t>
-      </w:r>
-    </w:p>
-    <w:p>
-      <w:r>
-        <w:t>Google website thing</w:t>
-      </w:r>
-    </w:p>
-    <w:p/>
-    <w:p/>
-    <w:p>
-      <w:pPr>
-        <w:pStyle w:val="Heading2"/>
-      </w:pPr>
-      <w:r>
         <w:t>FUTURE</w:t>
+      </w:r>
+    </w:p>
+    <w:p/>
+    <w:p>
+      <w:r>
+        <w:t>I want to create a page that helps users to rank their next destination</w:t>
+      </w:r>
+    </w:p>
+    <w:p>
+      <w:r>
+        <w:lastRenderedPageBreak/>
+        <w:t xml:space="preserve">Part of the world. </w:t>
       </w:r>
     </w:p>
     <w:sectPr>
@@ -440,7 +717,312 @@
 </file>
 
 <file path=word/numbering.xml><?xml version="1.0" encoding="utf-8"?>
-<w:numbering xmlns:wpc="http://schemas.microsoft.com/office/word/2010/wordprocessingCanvas" xmlns:cx="http://schemas.microsoft.com/office/drawing/2014/chartex" xmlns:cx1="http://schemas.microsoft.com/office/drawing/2015/9/8/chartex" xmlns:cx2="http://schemas.microsoft.com/office/drawing/2015/10/21/chartex" xmlns:cx3="http://schemas.microsoft.com/office/drawing/2016/5/9/chartex" xmlns:cx4="http://schemas.microsoft.com/office/drawing/2016/5/10/chartex" xmlns:cx5="http://schemas.microsoft.com/office/drawing/2016/5/11/chartex" xmlns:cx6="http://schemas.microsoft.com/office/drawing/2016/5/12/chartex" xmlns:cx7="http://schemas.microsoft.com/office/drawing/2016/5/13/chartex" xmlns:cx8="http://schemas.microsoft.com/office/drawing/2016/5/14/chartex" xmlns:mc="http://schemas.openxmlformats.org/markup-compatibility/2006" xmlns:aink="http://schemas.microsoft.com/office/drawing/2016/ink" xmlns:am3d="http://schemas.microsoft.com/office/drawing/2017/model3d" xmlns:o="urn:schemas-microsoft-com:office:office" xmlns:oel="http://schemas.microsoft.com/office/2019/extlst" xmlns:r="http://schemas.openxmlformats.org/officeDocument/2006/relationships" xmlns:m="http://schemas.openxmlformats.org/officeDocument/2006/math" xmlns:v="urn:schemas-microsoft-com:vml" xmlns:wp14="http://schemas.microsoft.com/office/word/2010/wordprocessingDrawing" xmlns:wp="http://schemas.openxmlformats.org/drawingml/2006/wordprocessingDrawing" xmlns:w10="urn:schemas-microsoft-com:office:word" xmlns:w="http://schemas.openxmlformats.org/wordprocessingml/2006/main" xmlns:w14="http://schemas.microsoft.com/office/word/2010/wordml" xmlns:w15="http://schemas.microsoft.com/office/word/2012/wordml" xmlns:w16cex="http://schemas.microsoft.com/office/word/2018/wordml/cex" xmlns:w16cid="http://schemas.microsoft.com/office/word/2016/wordml/cid" xmlns:w16="http://schemas.microsoft.com/office/word/2018/wordml" xmlns:w16du="http://schemas.microsoft.com/office/word/2023/wordml/word16du" xmlns:w16sdtdh="http://schemas.microsoft.com/office/word/2020/wordml/sdtdatahash" xmlns:w16sdtfl="http://schemas.microsoft.com/office/word/2024/wordml/sdtformatlock" xmlns:w16se="http://schemas.microsoft.com/office/word/2015/wordml/symex" xmlns:wpg="http://schemas.microsoft.com/office/word/2010/wordprocessingGroup" xmlns:wpi="http://schemas.microsoft.com/office/word/2010/wordprocessingInk" xmlns:wne="http://schemas.microsoft.com/office/word/2006/wordml" xmlns:wps="http://schemas.microsoft.com/office/word/2010/wordprocessingShape" mc:Ignorable="w14 w15 w16se w16cid w16 w16cex w16sdtdh w16sdtfl w16du wp14"/>
+<w:numbering xmlns:wpc="http://schemas.microsoft.com/office/word/2010/wordprocessingCanvas" xmlns:cx="http://schemas.microsoft.com/office/drawing/2014/chartex" xmlns:cx1="http://schemas.microsoft.com/office/drawing/2015/9/8/chartex" xmlns:cx2="http://schemas.microsoft.com/office/drawing/2015/10/21/chartex" xmlns:cx3="http://schemas.microsoft.com/office/drawing/2016/5/9/chartex" xmlns:cx4="http://schemas.microsoft.com/office/drawing/2016/5/10/chartex" xmlns:cx5="http://schemas.microsoft.com/office/drawing/2016/5/11/chartex" xmlns:cx6="http://schemas.microsoft.com/office/drawing/2016/5/12/chartex" xmlns:cx7="http://schemas.microsoft.com/office/drawing/2016/5/13/chartex" xmlns:cx8="http://schemas.microsoft.com/office/drawing/2016/5/14/chartex" xmlns:mc="http://schemas.openxmlformats.org/markup-compatibility/2006" xmlns:aink="http://schemas.microsoft.com/office/drawing/2016/ink" xmlns:am3d="http://schemas.microsoft.com/office/drawing/2017/model3d" xmlns:o="urn:schemas-microsoft-com:office:office" xmlns:oel="http://schemas.microsoft.com/office/2019/extlst" xmlns:r="http://schemas.openxmlformats.org/officeDocument/2006/relationships" xmlns:m="http://schemas.openxmlformats.org/officeDocument/2006/math" xmlns:v="urn:schemas-microsoft-com:vml" xmlns:wp14="http://schemas.microsoft.com/office/word/2010/wordprocessingDrawing" xmlns:wp="http://schemas.openxmlformats.org/drawingml/2006/wordprocessingDrawing" xmlns:w10="urn:schemas-microsoft-com:office:word" xmlns:w="http://schemas.openxmlformats.org/wordprocessingml/2006/main" xmlns:w14="http://schemas.microsoft.com/office/word/2010/wordml" xmlns:w15="http://schemas.microsoft.com/office/word/2012/wordml" xmlns:w16cex="http://schemas.microsoft.com/office/word/2018/wordml/cex" xmlns:w16cid="http://schemas.microsoft.com/office/word/2016/wordml/cid" xmlns:w16="http://schemas.microsoft.com/office/word/2018/wordml" xmlns:w16du="http://schemas.microsoft.com/office/word/2023/wordml/word16du" xmlns:w16sdtdh="http://schemas.microsoft.com/office/word/2020/wordml/sdtdatahash" xmlns:w16sdtfl="http://schemas.microsoft.com/office/word/2024/wordml/sdtformatlock" xmlns:w16se="http://schemas.microsoft.com/office/word/2015/wordml/symex" xmlns:wpg="http://schemas.microsoft.com/office/word/2010/wordprocessingGroup" xmlns:wpi="http://schemas.microsoft.com/office/word/2010/wordprocessingInk" xmlns:wne="http://schemas.microsoft.com/office/word/2006/wordml" xmlns:wps="http://schemas.microsoft.com/office/word/2010/wordprocessingShape" mc:Ignorable="w14 w15 w16se w16cid w16 w16cex w16sdtdh w16sdtfl w16du wp14">
+  <w:abstractNum w:abstractNumId="0" w15:restartNumberingAfterBreak="0">
+    <w:nsid w:val="32B1671B"/>
+    <w:multiLevelType w:val="multilevel"/>
+    <w:tmpl w:val="89ACFAEE"/>
+    <w:lvl w:ilvl="0">
+      <w:start w:val="1"/>
+      <w:numFmt w:val="bullet"/>
+      <w:lvlText w:val=""/>
+      <w:lvlJc w:val="left"/>
+      <w:pPr>
+        <w:tabs>
+          <w:tab w:val="num" w:pos="720"/>
+        </w:tabs>
+        <w:ind w:left="720" w:hanging="360"/>
+      </w:pPr>
+      <w:rPr>
+        <w:rFonts w:ascii="Symbol" w:hAnsi="Symbol" w:hint="default"/>
+        <w:sz w:val="20"/>
+      </w:rPr>
+    </w:lvl>
+    <w:lvl w:ilvl="1" w:tentative="1">
+      <w:start w:val="1"/>
+      <w:numFmt w:val="bullet"/>
+      <w:lvlText w:val=""/>
+      <w:lvlJc w:val="left"/>
+      <w:pPr>
+        <w:tabs>
+          <w:tab w:val="num" w:pos="1440"/>
+        </w:tabs>
+        <w:ind w:left="1440" w:hanging="360"/>
+      </w:pPr>
+      <w:rPr>
+        <w:rFonts w:ascii="Symbol" w:hAnsi="Symbol" w:hint="default"/>
+        <w:sz w:val="20"/>
+      </w:rPr>
+    </w:lvl>
+    <w:lvl w:ilvl="2" w:tentative="1">
+      <w:start w:val="1"/>
+      <w:numFmt w:val="bullet"/>
+      <w:lvlText w:val=""/>
+      <w:lvlJc w:val="left"/>
+      <w:pPr>
+        <w:tabs>
+          <w:tab w:val="num" w:pos="2160"/>
+        </w:tabs>
+        <w:ind w:left="2160" w:hanging="360"/>
+      </w:pPr>
+      <w:rPr>
+        <w:rFonts w:ascii="Symbol" w:hAnsi="Symbol" w:hint="default"/>
+        <w:sz w:val="20"/>
+      </w:rPr>
+    </w:lvl>
+    <w:lvl w:ilvl="3" w:tentative="1">
+      <w:start w:val="1"/>
+      <w:numFmt w:val="bullet"/>
+      <w:lvlText w:val=""/>
+      <w:lvlJc w:val="left"/>
+      <w:pPr>
+        <w:tabs>
+          <w:tab w:val="num" w:pos="2880"/>
+        </w:tabs>
+        <w:ind w:left="2880" w:hanging="360"/>
+      </w:pPr>
+      <w:rPr>
+        <w:rFonts w:ascii="Symbol" w:hAnsi="Symbol" w:hint="default"/>
+        <w:sz w:val="20"/>
+      </w:rPr>
+    </w:lvl>
+    <w:lvl w:ilvl="4" w:tentative="1">
+      <w:start w:val="1"/>
+      <w:numFmt w:val="bullet"/>
+      <w:lvlText w:val=""/>
+      <w:lvlJc w:val="left"/>
+      <w:pPr>
+        <w:tabs>
+          <w:tab w:val="num" w:pos="3600"/>
+        </w:tabs>
+        <w:ind w:left="3600" w:hanging="360"/>
+      </w:pPr>
+      <w:rPr>
+        <w:rFonts w:ascii="Symbol" w:hAnsi="Symbol" w:hint="default"/>
+        <w:sz w:val="20"/>
+      </w:rPr>
+    </w:lvl>
+    <w:lvl w:ilvl="5" w:tentative="1">
+      <w:start w:val="1"/>
+      <w:numFmt w:val="bullet"/>
+      <w:lvlText w:val=""/>
+      <w:lvlJc w:val="left"/>
+      <w:pPr>
+        <w:tabs>
+          <w:tab w:val="num" w:pos="4320"/>
+        </w:tabs>
+        <w:ind w:left="4320" w:hanging="360"/>
+      </w:pPr>
+      <w:rPr>
+        <w:rFonts w:ascii="Symbol" w:hAnsi="Symbol" w:hint="default"/>
+        <w:sz w:val="20"/>
+      </w:rPr>
+    </w:lvl>
+    <w:lvl w:ilvl="6" w:tentative="1">
+      <w:start w:val="1"/>
+      <w:numFmt w:val="bullet"/>
+      <w:lvlText w:val=""/>
+      <w:lvlJc w:val="left"/>
+      <w:pPr>
+        <w:tabs>
+          <w:tab w:val="num" w:pos="5040"/>
+        </w:tabs>
+        <w:ind w:left="5040" w:hanging="360"/>
+      </w:pPr>
+      <w:rPr>
+        <w:rFonts w:ascii="Symbol" w:hAnsi="Symbol" w:hint="default"/>
+        <w:sz w:val="20"/>
+      </w:rPr>
+    </w:lvl>
+    <w:lvl w:ilvl="7" w:tentative="1">
+      <w:start w:val="1"/>
+      <w:numFmt w:val="bullet"/>
+      <w:lvlText w:val=""/>
+      <w:lvlJc w:val="left"/>
+      <w:pPr>
+        <w:tabs>
+          <w:tab w:val="num" w:pos="5760"/>
+        </w:tabs>
+        <w:ind w:left="5760" w:hanging="360"/>
+      </w:pPr>
+      <w:rPr>
+        <w:rFonts w:ascii="Symbol" w:hAnsi="Symbol" w:hint="default"/>
+        <w:sz w:val="20"/>
+      </w:rPr>
+    </w:lvl>
+    <w:lvl w:ilvl="8" w:tentative="1">
+      <w:start w:val="1"/>
+      <w:numFmt w:val="bullet"/>
+      <w:lvlText w:val=""/>
+      <w:lvlJc w:val="left"/>
+      <w:pPr>
+        <w:tabs>
+          <w:tab w:val="num" w:pos="6480"/>
+        </w:tabs>
+        <w:ind w:left="6480" w:hanging="360"/>
+      </w:pPr>
+      <w:rPr>
+        <w:rFonts w:ascii="Symbol" w:hAnsi="Symbol" w:hint="default"/>
+        <w:sz w:val="20"/>
+      </w:rPr>
+    </w:lvl>
+  </w:abstractNum>
+  <w:abstractNum w:abstractNumId="1" w15:restartNumberingAfterBreak="0">
+    <w:nsid w:val="43A148E5"/>
+    <w:multiLevelType w:val="multilevel"/>
+    <w:tmpl w:val="9F0629CE"/>
+    <w:lvl w:ilvl="0">
+      <w:start w:val="1"/>
+      <w:numFmt w:val="bullet"/>
+      <w:lvlText w:val=""/>
+      <w:lvlJc w:val="left"/>
+      <w:pPr>
+        <w:tabs>
+          <w:tab w:val="num" w:pos="720"/>
+        </w:tabs>
+        <w:ind w:left="720" w:hanging="360"/>
+      </w:pPr>
+      <w:rPr>
+        <w:rFonts w:ascii="Symbol" w:hAnsi="Symbol" w:hint="default"/>
+        <w:sz w:val="20"/>
+      </w:rPr>
+    </w:lvl>
+    <w:lvl w:ilvl="1" w:tentative="1">
+      <w:start w:val="1"/>
+      <w:numFmt w:val="bullet"/>
+      <w:lvlText w:val=""/>
+      <w:lvlJc w:val="left"/>
+      <w:pPr>
+        <w:tabs>
+          <w:tab w:val="num" w:pos="1440"/>
+        </w:tabs>
+        <w:ind w:left="1440" w:hanging="360"/>
+      </w:pPr>
+      <w:rPr>
+        <w:rFonts w:ascii="Symbol" w:hAnsi="Symbol" w:hint="default"/>
+        <w:sz w:val="20"/>
+      </w:rPr>
+    </w:lvl>
+    <w:lvl w:ilvl="2" w:tentative="1">
+      <w:start w:val="1"/>
+      <w:numFmt w:val="bullet"/>
+      <w:lvlText w:val=""/>
+      <w:lvlJc w:val="left"/>
+      <w:pPr>
+        <w:tabs>
+          <w:tab w:val="num" w:pos="2160"/>
+        </w:tabs>
+        <w:ind w:left="2160" w:hanging="360"/>
+      </w:pPr>
+      <w:rPr>
+        <w:rFonts w:ascii="Symbol" w:hAnsi="Symbol" w:hint="default"/>
+        <w:sz w:val="20"/>
+      </w:rPr>
+    </w:lvl>
+    <w:lvl w:ilvl="3" w:tentative="1">
+      <w:start w:val="1"/>
+      <w:numFmt w:val="bullet"/>
+      <w:lvlText w:val=""/>
+      <w:lvlJc w:val="left"/>
+      <w:pPr>
+        <w:tabs>
+          <w:tab w:val="num" w:pos="2880"/>
+        </w:tabs>
+        <w:ind w:left="2880" w:hanging="360"/>
+      </w:pPr>
+      <w:rPr>
+        <w:rFonts w:ascii="Symbol" w:hAnsi="Symbol" w:hint="default"/>
+        <w:sz w:val="20"/>
+      </w:rPr>
+    </w:lvl>
+    <w:lvl w:ilvl="4" w:tentative="1">
+      <w:start w:val="1"/>
+      <w:numFmt w:val="bullet"/>
+      <w:lvlText w:val=""/>
+      <w:lvlJc w:val="left"/>
+      <w:pPr>
+        <w:tabs>
+          <w:tab w:val="num" w:pos="3600"/>
+        </w:tabs>
+        <w:ind w:left="3600" w:hanging="360"/>
+      </w:pPr>
+      <w:rPr>
+        <w:rFonts w:ascii="Symbol" w:hAnsi="Symbol" w:hint="default"/>
+        <w:sz w:val="20"/>
+      </w:rPr>
+    </w:lvl>
+    <w:lvl w:ilvl="5" w:tentative="1">
+      <w:start w:val="1"/>
+      <w:numFmt w:val="bullet"/>
+      <w:lvlText w:val=""/>
+      <w:lvlJc w:val="left"/>
+      <w:pPr>
+        <w:tabs>
+          <w:tab w:val="num" w:pos="4320"/>
+        </w:tabs>
+        <w:ind w:left="4320" w:hanging="360"/>
+      </w:pPr>
+      <w:rPr>
+        <w:rFonts w:ascii="Symbol" w:hAnsi="Symbol" w:hint="default"/>
+        <w:sz w:val="20"/>
+      </w:rPr>
+    </w:lvl>
+    <w:lvl w:ilvl="6" w:tentative="1">
+      <w:start w:val="1"/>
+      <w:numFmt w:val="bullet"/>
+      <w:lvlText w:val=""/>
+      <w:lvlJc w:val="left"/>
+      <w:pPr>
+        <w:tabs>
+          <w:tab w:val="num" w:pos="5040"/>
+        </w:tabs>
+        <w:ind w:left="5040" w:hanging="360"/>
+      </w:pPr>
+      <w:rPr>
+        <w:rFonts w:ascii="Symbol" w:hAnsi="Symbol" w:hint="default"/>
+        <w:sz w:val="20"/>
+      </w:rPr>
+    </w:lvl>
+    <w:lvl w:ilvl="7" w:tentative="1">
+      <w:start w:val="1"/>
+      <w:numFmt w:val="bullet"/>
+      <w:lvlText w:val=""/>
+      <w:lvlJc w:val="left"/>
+      <w:pPr>
+        <w:tabs>
+          <w:tab w:val="num" w:pos="5760"/>
+        </w:tabs>
+        <w:ind w:left="5760" w:hanging="360"/>
+      </w:pPr>
+      <w:rPr>
+        <w:rFonts w:ascii="Symbol" w:hAnsi="Symbol" w:hint="default"/>
+        <w:sz w:val="20"/>
+      </w:rPr>
+    </w:lvl>
+    <w:lvl w:ilvl="8" w:tentative="1">
+      <w:start w:val="1"/>
+      <w:numFmt w:val="bullet"/>
+      <w:lvlText w:val=""/>
+      <w:lvlJc w:val="left"/>
+      <w:pPr>
+        <w:tabs>
+          <w:tab w:val="num" w:pos="6480"/>
+        </w:tabs>
+        <w:ind w:left="6480" w:hanging="360"/>
+      </w:pPr>
+      <w:rPr>
+        <w:rFonts w:ascii="Symbol" w:hAnsi="Symbol" w:hint="default"/>
+        <w:sz w:val="20"/>
+      </w:rPr>
+    </w:lvl>
+  </w:abstractNum>
+  <w:num w:numId="1" w16cid:durableId="530612018">
+    <w:abstractNumId w:val="0"/>
+  </w:num>
+  <w:num w:numId="2" w16cid:durableId="132218494">
+    <w:abstractNumId w:val="1"/>
+  </w:num>
+</w:numbering>
 </file>
 
 <file path=word/styles.xml><?xml version="1.0" encoding="utf-8"?>

</xml_diff>

<commit_message>
Update 50 five-star hotel guides
</commit_message>
<xml_diff>
--- a/50fivestarhotels.docx
+++ b/50fivestarhotels.docx
@@ -473,7 +473,14 @@
       </w:hyperlink>
     </w:p>
     <w:p/>
-    <w:p/>
+    <w:p>
+      <w:r>
+        <w:rPr>
+          <w:highlight w:val="green"/>
+        </w:rPr>
+        <w:t>Google Analytics 4 (GA4)</w:t>
+      </w:r>
+    </w:p>
     <w:p/>
     <w:p>
       <w:pPr>
@@ -502,189 +509,91 @@
         <w:t>NEXT</w:t>
       </w:r>
     </w:p>
-    <w:p/>
-    <w:p>
-      <w:pPr>
+    <w:p>
+      <w:r>
+        <w:t>Set up</w:t>
+      </w:r>
+    </w:p>
+    <w:p>
+      <w:r>
+        <w:rPr>
+          <w:highlight w:val="green"/>
+        </w:rPr>
+        <w:t>Google Analytics 4 (GA4)</w:t>
+      </w:r>
+    </w:p>
+    <w:p>
+      <w:hyperlink r:id="rId7" w:history="1">
+        <w:r>
+          <w:rPr>
+            <w:rStyle w:val="Hyperlink"/>
+          </w:rPr>
+          <w:t>https://analytics.google.com/analytics/web/provision/#/a397047860p540527965/reports/intelligenthome?params=_u..nav%3Dmaui</w:t>
+        </w:r>
+      </w:hyperlink>
+    </w:p>
+    <w:p/>
+    <w:p/>
+    <w:p/>
+    <w:p>
+      <w:r>
+        <w:t xml:space="preserve">3 countries in </w:t>
+      </w:r>
+      <w:r>
+        <w:t>Europe</w:t>
+      </w:r>
+      <w:r>
+        <w:t xml:space="preserve"> most visited by American tourists?</w:t>
+      </w:r>
+    </w:p>
+    <w:p>
+      <w:r>
+        <w:t>England Scotland</w:t>
+      </w:r>
+    </w:p>
+    <w:p>
+      <w:r>
+        <w:t>France</w:t>
+      </w:r>
+    </w:p>
+    <w:p>
+      <w:r>
+        <w:t>Italy</w:t>
+      </w:r>
+    </w:p>
+    <w:p/>
+    <w:p>
+      <w:r>
+        <w:t xml:space="preserve">Remove from </w:t>
+      </w:r>
+    </w:p>
+    <w:p>
+      <w:r>
+        <w:t>https://50fivestarhotels.com/</w:t>
+      </w:r>
+    </w:p>
+    <w:p>
+      <w:r>
+        <w:t>Our method</w:t>
+      </w:r>
+    </w:p>
+    <w:p>
+      <w:r>
+        <w:t>How we choose hotels</w:t>
+      </w:r>
+    </w:p>
+    <w:p/>
+    <w:p/>
+    <w:p>
+      <w:r>
         <w:rPr>
           <w:highlight w:val="yellow"/>
         </w:rPr>
-      </w:pPr>
-      <w:r>
-        <w:rPr>
-          <w:highlight w:val="yellow"/>
-        </w:rPr>
-        <w:t>Add in an air quality bar per hotel</w:t>
-      </w:r>
-    </w:p>
-    <w:p>
-      <w:r>
-        <w:rPr>
-          <w:highlight w:val="yellow"/>
-        </w:rPr>
-        <w:t>https://50fivestarhotels.com/</w:t>
-      </w:r>
-    </w:p>
-    <w:p>
-      <w:r>
-        <w:drawing>
-          <wp:inline distT="0" distB="0" distL="0" distR="0" wp14:anchorId="42ABDB6F" wp14:editId="0EABE821">
-            <wp:extent cx="5731510" cy="2085975"/>
-            <wp:effectExtent l="0" t="0" r="2540" b="9525"/>
-            <wp:docPr id="178188374" name="Picture 1"/>
-            <wp:cNvGraphicFramePr>
-              <a:graphicFrameLocks xmlns:a="http://schemas.openxmlformats.org/drawingml/2006/main" noChangeAspect="1"/>
-            </wp:cNvGraphicFramePr>
-            <a:graphic xmlns:a="http://schemas.openxmlformats.org/drawingml/2006/main">
-              <a:graphicData uri="http://schemas.openxmlformats.org/drawingml/2006/picture">
-                <pic:pic xmlns:pic="http://schemas.openxmlformats.org/drawingml/2006/picture">
-                  <pic:nvPicPr>
-                    <pic:cNvPr id="178188374" name=""/>
-                    <pic:cNvPicPr/>
-                  </pic:nvPicPr>
-                  <pic:blipFill>
-                    <a:blip r:embed="rId7"/>
-                    <a:stretch>
-                      <a:fillRect/>
-                    </a:stretch>
-                  </pic:blipFill>
-                  <pic:spPr>
-                    <a:xfrm>
-                      <a:off x="0" y="0"/>
-                      <a:ext cx="5731510" cy="2085975"/>
-                    </a:xfrm>
-                    <a:prstGeom prst="rect">
-                      <a:avLst/>
-                    </a:prstGeom>
-                  </pic:spPr>
-                </pic:pic>
-              </a:graphicData>
-            </a:graphic>
-          </wp:inline>
-        </w:drawing>
-      </w:r>
-    </w:p>
-    <w:p/>
-    <w:p>
-      <w:r>
-        <w:rPr>
-          <w:highlight w:val="yellow"/>
-        </w:rPr>
-        <w:t xml:space="preserve">wrap the weather, </w:t>
-      </w:r>
-      <w:proofErr w:type="spellStart"/>
-      <w:r>
-        <w:rPr>
-          <w:highlight w:val="yellow"/>
-        </w:rPr>
-        <w:t>aq</w:t>
-      </w:r>
-      <w:proofErr w:type="spellEnd"/>
-      <w:r>
-        <w:rPr>
-          <w:highlight w:val="yellow"/>
-        </w:rPr>
-        <w:t xml:space="preserve"> and price cards for mobile</w:t>
-      </w:r>
-    </w:p>
-    <w:p/>
-    <w:p>
-      <w:r>
-        <w:t>In Codex</w:t>
-      </w:r>
-    </w:p>
-    <w:p>
-      <w:pPr>
-        <w:rPr>
-          <w:highlight w:val="yellow"/>
-        </w:rPr>
-      </w:pPr>
-      <w:r>
-        <w:rPr>
-          <w:highlight w:val="yellow"/>
-        </w:rPr>
-        <w:t>The daylight image is not generated yet: the built-in image tool returned </w:t>
-      </w:r>
-      <w:proofErr w:type="spellStart"/>
-      <w:r>
-        <w:rPr>
-          <w:highlight w:val="yellow"/>
-        </w:rPr>
-        <w:t>TooManyRequests</w:t>
-      </w:r>
-      <w:proofErr w:type="spellEnd"/>
-      <w:r>
-        <w:rPr>
-          <w:highlight w:val="yellow"/>
-        </w:rPr>
-        <w:t> on repeated retries. I left the placeholder marker at:</w:t>
-      </w:r>
-    </w:p>
-    <w:p>
-      <w:pPr>
-        <w:rPr>
-          <w:highlight w:val="yellow"/>
-        </w:rPr>
-      </w:pPr>
-      <w:r>
-        <w:rPr>
-          <w:highlight w:val="yellow"/>
-        </w:rPr>
-        <w:t>C:\Users\Gary\code\50fivestarhotels\public\images\hotels\bar-peepal-resort-pokhara-realistic-daylight.webp.txt</w:t>
-      </w:r>
-    </w:p>
-    <w:p>
-      <w:r>
-        <w:rPr>
-          <w:highlight w:val="yellow"/>
-        </w:rPr>
-        <w:t>The daylight prompt is ready in the prompt file for the next run once the image rate limit clears.</w:t>
-      </w:r>
-    </w:p>
-    <w:p/>
-    <w:p/>
-    <w:p>
-      <w:r>
-        <w:t>The brief's own next step: add profile pages for the 5 candidates that already have AI images but no content file (Meliá Yangon, Grand Mercure Medan, NH Collection Bogotá, Novotel Ahmedabad, Mandarin Colombo) — their public/images/hotels/* assets are currently orphaned.</w:t>
-      </w:r>
-    </w:p>
-    <w:p/>
-    <w:p>
-      <w:pPr>
-        <w:rPr>
-          <w:b/>
-          <w:bCs/>
-          <w:highlight w:val="yellow"/>
-        </w:rPr>
-      </w:pPr>
-      <w:r>
-        <w:rPr>
-          <w:b/>
-          <w:bCs/>
-          <w:highlight w:val="yellow"/>
-        </w:rPr>
-        <w:t>10 practical tips to help you decide</w:t>
-      </w:r>
-    </w:p>
-    <w:p>
-      <w:r>
-        <w:rPr>
-          <w:highlight w:val="yellow"/>
-        </w:rPr>
-        <w:t xml:space="preserve">Copy this styling from </w:t>
-      </w:r>
-      <w:r>
-        <w:rPr>
-          <w:highlight w:val="yellow"/>
-        </w:rPr>
-        <w:t>50beautiful pages</w:t>
-      </w:r>
-    </w:p>
-    <w:p/>
-    <w:p>
-      <w:r>
-        <w:t>List of why to go to this area where the hotel is located</w:t>
-      </w:r>
-    </w:p>
+        <w:t>add profile pages for the 5 candidates that already have AI images but no content file (Meliá Yangon, Grand Mercure Medan, NH Collection Bogotá, Novotel Ahmedabad, Mandarin Colombo) — their public/images/hotels/* assets are currently orphaned.</w:t>
+      </w:r>
+    </w:p>
+    <w:p/>
+    <w:p/>
     <w:p/>
     <w:p>
       <w:pPr>
@@ -702,7 +611,6 @@
     </w:p>
     <w:p>
       <w:r>
-        <w:lastRenderedPageBreak/>
         <w:t xml:space="preserve">Part of the world. </w:t>
       </w:r>
     </w:p>
@@ -1624,6 +1532,7 @@
   <w:style w:type="character" w:default="1" w:styleId="DefaultParagraphFont">
     <w:name w:val="Default Paragraph Font"/>
     <w:uiPriority w:val="1"/>
+    <w:semiHidden/>
     <w:unhideWhenUsed/>
   </w:style>
   <w:style w:type="table" w:default="1" w:styleId="TableNormal">

</xml_diff>